<commit_message>
Clarify source and rationale for 84-label vocabulary in report
Explain that the 84 labels were enumerated from the dataset's
output_disease column (no separate vocab file was provided), and
why listing them in the prompt is the right response for a
closed-set extraction task.

Co-Authored-By: Claude Sonnet 4.6 <noreply@anthropic.com>
</commit_message>
<xml_diff>
--- a/results/Technical_Report.docx
+++ b/results/Technical_Report.docx
@@ -115,7 +115,20 @@
           <w:sz w:val="22"/>
           <w:szCs w:val="22"/>
         </w:rPr>
-        <w:t xml:space="preserve">The dataset contains 1,236 radiology CT/MRI findings, each paired with one or more disease labels drawn from a fixed vocabulary of 84 categories. I split these 80/20 into 1,000 training and 236 test samples, using a fixed random seed (42) so the split is identical across both tasks.</w:t>
+        <w:t xml:space="preserve">The dataset contains 1,236 radiology CT/MRI findings, each paired with one or more disease labels drawn from a fixed vocabulary. I split these 80/20 into 1,000 training and 236 test samples, using a fixed random seed (42) so the split is identical across both tasks.</w:t>
+      </w:r>
+    </w:p>
+    <w:p>
+      <w:pPr>
+        <w:spacing w:after="140" w:before="0"/>
+      </w:pPr>
+      <w:r>
+        <w:rPr>
+          <w:rFonts w:ascii="Times New Roman" w:cs="Times New Roman" w:eastAsia="Times New Roman" w:hAnsi="Times New Roman"/>
+          <w:sz w:val="22"/>
+          <w:szCs w:val="22"/>
+        </w:rPr>
+        <w:t xml:space="preserve">The first thing I did before any modeling was enumerate all unique disease strings that appear in the output_disease column across the full dataset. This yielded 84 distinct labels. No separate vocabulary file was provided; these 84 strings are exactly what the annotators used, so they define the complete label space for this task. I used this list in two ways: as the target vocabulary for prompt-based inference in Task 1, and as the basis for understanding what the model needs to learn in Task 2.</w:t>
       </w:r>
     </w:p>
     <w:p>
@@ -287,7 +300,7 @@
           <w:sz w:val="22"/>
           <w:szCs w:val="22"/>
         </w:rPr>
-        <w:t xml:space="preserve">My initial assumption was that the biggest failure mode in a naive prompt would be label name mismatch: the model might correctly identify that a patient has a kidney cyst, but write "kidney cyst" or "renal lesion" instead of the exact string "Renal cyst" that the gold standard expects. To address this, I included the complete list of 84 approved labels in the system prompt, so the model has the full vocabulary in front of it.</w:t>
+        <w:t xml:space="preserve">Because this is a closed-set extraction task — the model must output labels from a fixed vocabulary, not generate free text — the most direct failure mode is label name mismatch: the model correctly identifies that a patient has a kidney cyst, but writes "kidney cyst" or "renal lesion" instead of the exact string "Renal cyst" that the gold standard expects. The natural response is to put the full vocabulary in front of the model at inference time, so it knows exactly which strings are valid outputs. I extracted the 84 unique label strings from the dataset (as described in Section 2) and included the complete list in the system prompt.</w:t>
       </w:r>
     </w:p>
     <w:p>

</xml_diff>